<commit_message>
research-program: regenerate three guarded DOCX exports for Ready620
<!-- workflow-source:local_request -->
</commit_message>
<xml_diff>
--- a/research-program/artifacts/dossiers/docx/00-PERSONAL-REUSE-NOTE.docx
+++ b/research-program/artifacts/dossiers/docx/00-PERSONAL-REUSE-NOTE.docx
@@ -184,7 +184,7 @@
           <w:i w:val="0"/>
           <w:sz w:val="20"/>
         </w:rPr>
-        <w:t>clones/Fine-Art-Archive/src/fine_art_archive/sidecar.py</w:t>
+        <w:t>[LOCAL_WORKSPACE]/Fine-Art-Archive/src/fine_art_archive/sidecar.py</w:t>
       </w:r>
       <w:r>
         <w:rPr>
@@ -502,7 +502,7 @@
           <w:i w:val="0"/>
           <w:sz w:val="20"/>
         </w:rPr>
-        <w:t>clones/Fine-Art-Archive/src/fine_art_archive/identity/work_qid_uniqueness.py</w:t>
+        <w:t>[LOCAL_WORKSPACE]/Fine-Art-Archive/src/fine_art_archive/identity/work_qid_uniqueness.py</w:t>
       </w:r>
       <w:r>
         <w:rPr>
@@ -730,7 +730,7 @@
           <w:i w:val="0"/>
           <w:sz w:val="20"/>
         </w:rPr>
-        <w:t>clones/Fine-Art-Archive/src/fine_art_archive/collect/verify.py</w:t>
+        <w:t>[LOCAL_WORKSPACE]/Fine-Art-Archive/src/fine_art_archive/collect/verify.py</w:t>
       </w:r>
     </w:p>
     <w:p>
@@ -940,7 +940,7 @@
           <w:i w:val="0"/>
           <w:sz w:val="20"/>
         </w:rPr>
-        <w:t>clones/Fine-Art-Archive/src/fine_art_archive/fixity.py</w:t>
+        <w:t>[LOCAL_WORKSPACE]/Fine-Art-Archive/src/fine_art_archive/fixity.py</w:t>
       </w:r>
       <w:r>
         <w:rPr>
@@ -1213,7 +1213,7 @@
           <w:i w:val="0"/>
           <w:sz w:val="20"/>
         </w:rPr>
-        <w:t>clones/Fine-Art-Archive/scripts/build_manifest.py</w:t>
+        <w:t>[LOCAL_WORKSPACE]/Fine-Art-Archive/scripts/build_manifest.py</w:t>
       </w:r>
       <w:r>
         <w:rPr>
@@ -1396,7 +1396,7 @@
           <w:i w:val="0"/>
           <w:sz w:val="20"/>
         </w:rPr>
-        <w:t>clones/Fine-Art-Archive/scripts/validate_run_contract.py</w:t>
+        <w:t>[LOCAL_WORKSPACE]/Fine-Art-Archive/scripts/validate_run_contract.py</w:t>
       </w:r>
     </w:p>
     <w:p>
@@ -2482,7 +2482,7 @@
           <w:i w:val="0"/>
           <w:sz w:val="20"/>
         </w:rPr>
-        <w:t>clones/trip-planner/trip_planner/app/services/planner_runtime_config.py</w:t>
+        <w:t>[LOCAL_WORKSPACE]/trip-planner/trip_planner/app/services/planner_runtime_config.py</w:t>
       </w:r>
       <w:r>
         <w:rPr>
@@ -2701,7 +2701,7 @@
           <w:i w:val="0"/>
           <w:sz w:val="20"/>
         </w:rPr>
-        <w:t>clones/trip-planner/trip_planner/sources/quality.py</w:t>
+        <w:t>[LOCAL_WORKSPACE]/trip-planner/trip_planner/sources/quality.py</w:t>
       </w:r>
       <w:r>
         <w:rPr>
@@ -2956,7 +2956,7 @@
           <w:i w:val="0"/>
           <w:sz w:val="20"/>
         </w:rPr>
-        <w:t>clones/trip-planner/trip_planner/integrations/tpp/client.py</w:t>
+        <w:t>[LOCAL_WORKSPACE]/trip-planner/trip_planner/integrations/tpp/client.py</w:t>
       </w:r>
       <w:r>
         <w:rPr>
@@ -3139,7 +3139,7 @@
           <w:i w:val="0"/>
           <w:sz w:val="20"/>
         </w:rPr>
-        <w:t>clones/trip-planner/trip_planner/ranking/base.py</w:t>
+        <w:t>[LOCAL_WORKSPACE]/trip-planner/trip_planner/ranking/base.py</w:t>
       </w:r>
       <w:r>
         <w:rPr>
@@ -3322,7 +3322,7 @@
           <w:i w:val="0"/>
           <w:sz w:val="20"/>
         </w:rPr>
-        <w:t>clones/trip-planner/scripts/measure_complexity.py</w:t>
+        <w:t>[LOCAL_WORKSPACE]/trip-planner/scripts/measure_complexity.py</w:t>
       </w:r>
     </w:p>
     <w:p>
@@ -4341,7 +4341,7 @@
           <w:i w:val="0"/>
           <w:sz w:val="20"/>
         </w:rPr>
-        <w:t>research-program/clones/</w:t>
+        <w:t>research-program/[LOCAL_WORKSPACE]/</w:t>
       </w:r>
       <w:r>
         <w:rPr>

</xml_diff>